<commit_message>
Popraw podpisy w IPZS czesc II i III
</commit_message>
<xml_diff>
--- a/public/wzory/CIS_B-03-2_Indywidualny_Program_Zatrudnienia_Socjalnego_cz_II.docx
+++ b/public/wzory/CIS_B-03-2_Indywidualny_Program_Zatrudnienia_Socjalnego_cz_II.docx
@@ -2428,245 +2428,192 @@
         <w:t>………………………………………………………………………………………………………………</w:t>
       </w:r>
     </w:p>
-    <w:p>
-      <w:pPr>
-        <w:widowControl w:val="0"/>
-        <w:autoSpaceDE w:val="0"/>
-        <w:autoSpaceDN w:val="0"/>
-        <w:spacing w:before="0" w:after="0" w:line="240" w:lineRule="auto"/>
-        <w:rPr>
-          <w:rFonts w:ascii="Arial" w:eastAsia="Arial" w:hAnsi="Arial" w:cs="Arial"/>
-          <w:sz w:val="20"/>
-          <w:szCs w:val="24"/>
-        </w:rPr>
-      </w:pPr>
-      <w:r>
-        <w:rPr>
-          <w:rFonts w:ascii="Arial" w:eastAsia="Arial" w:hAnsi="Arial" w:cs="Arial"/>
-          <w:sz w:val="17"/>
-          <w:szCs w:val="24"/>
-        </w:rPr>
-        <w:t xml:space="preserve">          ……………………………………                                                                    ……………………………….</w:t>
-      </w:r>
-    </w:p>
-    <w:p>
-      <w:pPr>
-        <w:widowControl w:val="0"/>
-        <w:tabs>
-          <w:tab w:val="left" w:pos="7500"/>
-        </w:tabs>
-        <w:autoSpaceDE w:val="0"/>
-        <w:autoSpaceDN w:val="0"/>
-        <w:spacing w:after="0" w:line="240" w:lineRule="auto" w:before="0"/>
-        <w:ind w:left="621"/>
-        <w:rPr>
-          <w:rFonts w:ascii="Arial" w:eastAsia="Arial" w:hAnsi="Arial" w:cs="Arial"/>
-          <w:sz w:val="20"/>
-        </w:rPr>
-      </w:pPr>
-      <w:r>
-        <w:rPr>
-          <w:rFonts w:ascii="Arial" w:eastAsia="Arial" w:hAnsi="Arial" w:cs="Arial"/>
-          <w:sz w:val="17"/>
-        </w:rPr>
-        <w:t>Podpis</w:t>
-      </w:r>
-      <w:r>
-        <w:rPr>
-          <w:rFonts w:ascii="Arial" w:eastAsia="Arial" w:hAnsi="Arial" w:cs="Arial"/>
-          <w:spacing w:val="-10"/>
-          <w:sz w:val="17"/>
-        </w:rPr>
-        <w:t xml:space="preserve"> </w:t>
-      </w:r>
-      <w:r>
-        <w:rPr>
-          <w:rFonts w:ascii="Arial" w:eastAsia="Arial" w:hAnsi="Arial" w:cs="Arial"/>
-          <w:sz w:val="17"/>
-        </w:rPr>
-        <w:t>uczestnika</w:t>
-      </w:r>
-      <w:r>
-        <w:rPr>
-          <w:rFonts w:ascii="Arial" w:eastAsia="Arial" w:hAnsi="Arial" w:cs="Arial"/>
-          <w:spacing w:val="-10"/>
-          <w:sz w:val="17"/>
-        </w:rPr>
-        <w:t xml:space="preserve"> </w:t>
-      </w:r>
-      <w:r>
-        <w:rPr>
-          <w:rFonts w:ascii="Arial" w:eastAsia="Arial" w:hAnsi="Arial" w:cs="Arial"/>
-          <w:spacing w:val="-5"/>
-          <w:sz w:val="17"/>
-        </w:rPr>
-        <w:t>CIS</w:t>
-      </w:r>
-      <w:r>
-        <w:rPr>
-          <w:rFonts w:ascii="Arial" w:eastAsia="Arial" w:hAnsi="Arial" w:cs="Arial"/>
-          <w:sz w:val="17"/>
-        </w:rPr>
-        <w:tab/>
-        <w:t>Pieczęć</w:t>
-      </w:r>
-      <w:r>
-        <w:rPr>
-          <w:rFonts w:ascii="Arial" w:eastAsia="Arial" w:hAnsi="Arial" w:cs="Arial"/>
-          <w:spacing w:val="-6"/>
-          <w:sz w:val="17"/>
-        </w:rPr>
-        <w:t xml:space="preserve"> </w:t>
-      </w:r>
-      <w:r>
-        <w:rPr>
-          <w:rFonts w:ascii="Arial" w:eastAsia="Arial" w:hAnsi="Arial" w:cs="Arial"/>
-          <w:sz w:val="17"/>
-        </w:rPr>
-        <w:t>i</w:t>
-      </w:r>
-      <w:r>
-        <w:rPr>
-          <w:rFonts w:ascii="Arial" w:eastAsia="Arial" w:hAnsi="Arial" w:cs="Arial"/>
-          <w:spacing w:val="-5"/>
-          <w:sz w:val="17"/>
-        </w:rPr>
-        <w:t xml:space="preserve"> </w:t>
-      </w:r>
-      <w:r>
-        <w:rPr>
-          <w:rFonts w:ascii="Arial" w:eastAsia="Arial" w:hAnsi="Arial" w:cs="Arial"/>
-          <w:spacing w:val="-2"/>
-          <w:sz w:val="17"/>
-        </w:rPr>
-        <w:t>podpis</w:t>
-      </w:r>
-    </w:p>
-    <w:p>
-      <w:pPr>
-        <w:widowControl w:val="0"/>
-        <w:autoSpaceDE w:val="0"/>
-        <w:autoSpaceDN w:val="0"/>
-        <w:spacing w:after="0" w:line="240" w:lineRule="auto" w:before="0"/>
-        <w:ind w:left="7078"/>
-        <w:rPr>
-          <w:rFonts w:ascii="Arial" w:eastAsia="Arial" w:hAnsi="Arial" w:cs="Arial"/>
-          <w:sz w:val="20"/>
-        </w:rPr>
-      </w:pPr>
-      <w:r>
-        <w:rPr>
-          <w:rFonts w:ascii="Arial" w:eastAsia="Arial" w:hAnsi="Arial" w:cs="Arial"/>
-          <w:spacing w:val="-2"/>
-          <w:sz w:val="18"/>
-        </w:rPr>
-        <w:t>Kierownika/Dyrektora</w:t>
-      </w:r>
-      <w:r>
-        <w:rPr>
-          <w:rFonts w:ascii="Arial" w:eastAsia="Arial" w:hAnsi="Arial" w:cs="Arial"/>
-          <w:spacing w:val="14"/>
-          <w:sz w:val="18"/>
-        </w:rPr>
-        <w:t xml:space="preserve"> </w:t>
-      </w:r>
-      <w:r>
-        <w:rPr>
-          <w:rFonts w:ascii="Arial" w:eastAsia="Arial" w:hAnsi="Arial" w:cs="Arial"/>
-          <w:spacing w:val="-5"/>
-          <w:sz w:val="18"/>
-        </w:rPr>
-        <w:t>CIS</w:t>
-      </w:r>
-    </w:p>
-    <w:p>
-      <w:pPr>
-        <w:widowControl w:val="0"/>
-        <w:autoSpaceDE w:val="0"/>
-        <w:autoSpaceDN w:val="0"/>
-        <w:spacing w:after="0" w:line="240" w:lineRule="auto" w:before="0"/>
-        <w:ind w:left="566" w:right="4547"/>
-        <w:rPr>
-          <w:rFonts w:ascii="Arial" w:eastAsia="Arial" w:hAnsi="Arial" w:cs="Arial"/>
-          <w:spacing w:val="-14"/>
-          <w:sz w:val="20"/>
-        </w:rPr>
-      </w:pPr>
-      <w:r>
-        <w:rPr>
-          <w:rFonts w:ascii="Arial" w:eastAsia="Arial" w:hAnsi="Arial" w:cs="Arial"/>
-          <w:sz w:val="17"/>
-        </w:rPr>
-        <w:t>Opracowanie</w:t>
-      </w:r>
-      <w:r>
-        <w:rPr>
-          <w:rFonts w:ascii="Arial" w:eastAsia="Arial" w:hAnsi="Arial" w:cs="Arial"/>
-          <w:spacing w:val="-14"/>
-          <w:sz w:val="17"/>
-        </w:rPr>
-        <w:t xml:space="preserve"> </w:t>
-      </w:r>
-      <w:r>
-        <w:rPr>
-          <w:rFonts w:ascii="Arial" w:eastAsia="Arial" w:hAnsi="Arial" w:cs="Arial"/>
-          <w:sz w:val="17"/>
-        </w:rPr>
-        <w:t>IPZS:</w:t>
-      </w:r>
-      <w:r>
-        <w:rPr>
-          <w:rFonts w:ascii="Arial" w:eastAsia="Arial" w:hAnsi="Arial" w:cs="Arial"/>
-          <w:spacing w:val="-14"/>
-          <w:sz w:val="17"/>
-        </w:rPr>
-        <w:t xml:space="preserve"> </w:t>
-      </w:r>
-    </w:p>
-    <w:p>
-      <w:pPr>
-        <w:widowControl w:val="0"/>
-        <w:autoSpaceDE w:val="0"/>
-        <w:autoSpaceDN w:val="0"/>
-        <w:spacing w:after="0" w:line="240" w:lineRule="auto" w:before="0"/>
-        <w:ind w:left="566" w:right="4547"/>
-        <w:rPr>
-          <w:rFonts w:ascii="Arial" w:eastAsia="Arial" w:hAnsi="Arial" w:cs="Arial"/>
-          <w:sz w:val="20"/>
-        </w:rPr>
-      </w:pPr>
-      <w:r>
-        <w:rPr>
-          <w:rFonts w:ascii="Arial" w:eastAsia="Arial" w:hAnsi="Arial" w:cs="Arial"/>
-          <w:sz w:val="17"/>
-        </w:rPr>
-        <w:t>…………………………………………..</w:t>
-      </w:r>
-    </w:p>
-    <w:p>
-      <w:pPr>
-        <w:spacing w:before="0" w:after="0" w:line="240" w:lineRule="auto"/>
-        <w:rPr>
-          <w:rFonts w:ascii="Times New Roman" w:hAnsi="Times New Roman" w:cs="Times New Roman"/>
-          <w:b/>
-          <w:sz w:val="24"/>
-        </w:rPr>
-      </w:pPr>
-      <w:r>
-        <w:rPr>
-          <w:rFonts w:ascii="Arial" w:eastAsia="Arial" w:hAnsi="Arial" w:cs="Arial"/>
-          <w:sz w:val="17"/>
-        </w:rPr>
-        <w:t xml:space="preserve">           </w:t>
-      </w:r>
-      <w:r>
-        <w:rPr>
-          <w:rFonts w:ascii="Arial" w:eastAsia="Arial" w:hAnsi="Arial" w:cs="Arial"/>
-          <w:sz w:val="17"/>
-        </w:rPr>
-        <w:t>Podpis Pracownika socjalnego CIS</w:t>
-      </w:r>
-    </w:p>
+    <w:tbl>
+      <w:tblPr>
+        <w:tblW w:w="9014" w:type="dxa"/>
+        <w:tblBorders>
+          <w:top w:val="nil"/>
+          <w:left w:val="nil"/>
+          <w:bottom w:val="nil"/>
+          <w:right w:val="nil"/>
+          <w:insideH w:val="nil"/>
+          <w:insideV w:val="nil"/>
+        </w:tblBorders>
+        <w:tblLayout w:type="fixed"/>
+        <w:tblCellMar>
+          <w:top w:w="0" w:type="dxa"/>
+          <w:left w:w="100" w:type="dxa"/>
+          <w:bottom w:w="0" w:type="dxa"/>
+          <w:right w:w="100" w:type="dxa"/>
+        </w:tblCellMar>
+      </w:tblPr>
+      <w:tblGrid>
+        <w:gridCol w:w="3004"/>
+        <w:gridCol w:w="3005"/>
+        <w:gridCol w:w="3005"/>
+      </w:tblGrid>
+      <w:tr>
+        <w:tc>
+          <w:tcPr>
+            <w:tcW w:w="3004" w:type="dxa"/>
+          </w:tcPr>
+          <w:p>
+            <w:pPr>
+              <w:spacing w:before="0" w:after="0"/>
+              <w:jc w:val="center"/>
+            </w:pPr>
+          </w:p>
+        </w:tc>
+        <w:tc>
+          <w:tcPr>
+            <w:tcW w:w="3005" w:type="dxa"/>
+          </w:tcPr>
+          <w:p>
+            <w:pPr>
+              <w:spacing w:before="0" w:after="50"/>
+              <w:jc w:val="center"/>
+            </w:pPr>
+            <w:r>
+              <w:rPr>
+                <w:rFonts w:ascii="Arial" w:hAnsi="Arial" w:cs="Arial"/>
+                <w:sz w:val="20"/>
+                <w:szCs w:val="20"/>
+              </w:rPr>
+              <w:t>Opracowanie IPZS:</w:t>
+            </w:r>
+          </w:p>
+        </w:tc>
+        <w:tc>
+          <w:tcPr>
+            <w:tcW w:w="3005" w:type="dxa"/>
+          </w:tcPr>
+          <w:p>
+            <w:pPr>
+              <w:spacing w:before="0" w:after="0"/>
+              <w:jc w:val="center"/>
+            </w:pPr>
+          </w:p>
+        </w:tc>
+      </w:tr>
+      <w:tr>
+        <w:tc>
+          <w:tcPr>
+            <w:tcW w:w="3004" w:type="dxa"/>
+          </w:tcPr>
+          <w:p>
+            <w:pPr>
+              <w:spacing w:before="0" w:after="0"/>
+              <w:jc w:val="center"/>
+            </w:pPr>
+            <w:r>
+              <w:rPr>
+                <w:rFonts w:ascii="Arial" w:hAnsi="Arial" w:cs="Arial"/>
+                <w:sz w:val="20"/>
+                <w:szCs w:val="20"/>
+              </w:rPr>
+              <w:t>....................................</w:t>
+            </w:r>
+          </w:p>
+        </w:tc>
+        <w:tc>
+          <w:tcPr>
+            <w:tcW w:w="3005" w:type="dxa"/>
+          </w:tcPr>
+          <w:p>
+            <w:pPr>
+              <w:spacing w:before="0" w:after="0"/>
+              <w:jc w:val="center"/>
+            </w:pPr>
+            <w:r>
+              <w:rPr>
+                <w:rFonts w:ascii="Arial" w:hAnsi="Arial" w:cs="Arial"/>
+                <w:sz w:val="20"/>
+                <w:szCs w:val="20"/>
+              </w:rPr>
+              <w:t>....................................</w:t>
+            </w:r>
+          </w:p>
+        </w:tc>
+        <w:tc>
+          <w:tcPr>
+            <w:tcW w:w="3005" w:type="dxa"/>
+          </w:tcPr>
+          <w:p>
+            <w:pPr>
+              <w:spacing w:before="0" w:after="0"/>
+              <w:jc w:val="center"/>
+            </w:pPr>
+            <w:r>
+              <w:rPr>
+                <w:rFonts w:ascii="Arial" w:hAnsi="Arial" w:cs="Arial"/>
+                <w:sz w:val="20"/>
+                <w:szCs w:val="20"/>
+              </w:rPr>
+              <w:t>....................................</w:t>
+            </w:r>
+          </w:p>
+        </w:tc>
+      </w:tr>
+      <w:tr>
+        <w:tc>
+          <w:tcPr>
+            <w:tcW w:w="3004" w:type="dxa"/>
+          </w:tcPr>
+          <w:p>
+            <w:pPr>
+              <w:spacing w:before="35" w:after="0"/>
+              <w:jc w:val="center"/>
+            </w:pPr>
+            <w:r>
+              <w:rPr>
+                <w:rFonts w:ascii="Arial" w:hAnsi="Arial" w:cs="Arial"/>
+                <w:sz w:val="18"/>
+                <w:szCs w:val="18"/>
+              </w:rPr>
+              <w:t>Podpis uczestnika CIS</w:t>
+            </w:r>
+          </w:p>
+        </w:tc>
+        <w:tc>
+          <w:tcPr>
+            <w:tcW w:w="3005" w:type="dxa"/>
+          </w:tcPr>
+          <w:p>
+            <w:pPr>
+              <w:spacing w:before="35" w:after="0"/>
+              <w:jc w:val="center"/>
+            </w:pPr>
+            <w:r>
+              <w:rPr>
+                <w:rFonts w:ascii="Arial" w:hAnsi="Arial" w:cs="Arial"/>
+                <w:sz w:val="18"/>
+                <w:szCs w:val="18"/>
+              </w:rPr>
+              <w:t>Podpis pracownika socjalnego CIS</w:t>
+            </w:r>
+          </w:p>
+        </w:tc>
+        <w:tc>
+          <w:tcPr>
+            <w:tcW w:w="3005" w:type="dxa"/>
+          </w:tcPr>
+          <w:p>
+            <w:pPr>
+              <w:spacing w:before="35" w:after="0"/>
+              <w:jc w:val="center"/>
+            </w:pPr>
+            <w:r>
+              <w:rPr>
+                <w:rFonts w:ascii="Arial" w:hAnsi="Arial" w:cs="Arial"/>
+                <w:sz w:val="18"/>
+                <w:szCs w:val="18"/>
+              </w:rPr>
+              <w:t>Pieczęć i podpis Kierownika CIS</w:t>
+            </w:r>
+          </w:p>
+        </w:tc>
+      </w:tr>
+    </w:tbl>
     <w:sectPr>
       <w:headerReference w:type="default" r:id="rId8"/>
       <w:footerReference w:type="default" r:id="rId9"/>

</xml_diff>